<commit_message>
Atualiza minutas em andamento
Co-Authored-By: Claude Opus 5.5 <noreply@anthropic.com>
Claude-Session: https://claude.ai/code/session_013QDNUXax2KcndW1CBsMGWB
</commit_message>
<xml_diff>
--- a/MINUTA - SENTENCA - 0800855-23.2025.8.18.0056.docx
+++ b/MINUTA - SENTENCA - 0800855-23.2025.8.18.0056.docx
@@ -38,7 +38,7 @@
           <w:color w:val="000000"/>
           <w:sz w:val="24"/>
         </w:rPr>
-        <w:t xml:space="preserve">Trata-se de ação declaratória de inexistência de negócio jurídico cumulada com obrigação de fazer, repetição do indébito e danos morais proposta por ROSILDA DE MIRANDA SOUSA, em face de BANCO BRADESCO S.A., pelos motivos expostos na inicial.</w:t>
+        <w:t xml:space="preserve">Trata-se de ação declaratória de inexistência de negócio jurídico c/c obrigação de fazer, repetição do indébito e danos morais proposta por ROSILDA DE MIRANDA SOUSA, em face de BANCO BRADESCO S.A., pelos motivos expostos na inicial.</w:t>
       </w:r>
     </w:p>
     <w:p>
@@ -54,7 +54,7 @@
           <w:color w:val="000000"/>
           <w:sz w:val="24"/>
         </w:rPr>
-        <w:t xml:space="preserve">A parte autora alega na inicial (Id. 76683061), em resumo, que é aposentada e recebe seu benefício previdenciário em conta mantida junto ao réu, na qual, sem ter contratado ou autorizado, sofreu débitos mensais da tarifa “CESTA B.EXPRESSO1” de maio de 2020 a abril de 2024 (extratos de Ids. 76683071, 76683067, 76683066, 76683068 e 76683069), no valor de R$ 2.091,65.</w:t>
+        <w:t xml:space="preserve">A parte autora alega na inicial (Id. 76683061), em resumo, que sofreu, sem ter contratado, débitos da tarifa “CESTA B.EXPRESSO1” de maio de 2020 a abril de 2024 em sua conta de benefício previdenciário (extratos de Ids. 76683066 a 76683069 e 76683071), no valor de R$ 2.091,65.</w:t>
       </w:r>
     </w:p>
     <w:p>
@@ -70,7 +70,7 @@
           <w:color w:val="000000"/>
           <w:sz w:val="24"/>
         </w:rPr>
-        <w:t xml:space="preserve">Por isso, requer a declaração de inexistência dos débitos da referida tarifa, a restituição em dobro dos valores descontados, no montante de R$ 4.183,30, indenização por danos morais no valor de R$ 10.000,00, a exibição do contrato e a realização de perícia grafotécnica.</w:t>
+        <w:t xml:space="preserve">Por isso, requer a declaração de inexistência do débito, a restituição em dobro (R$ 4.183,30), indenização por danos morais de R$ 10.000,00 e a exibição do contrato.</w:t>
       </w:r>
     </w:p>
     <w:p>
@@ -86,7 +86,7 @@
           <w:color w:val="000000"/>
           <w:sz w:val="24"/>
         </w:rPr>
-        <w:t xml:space="preserve">Citado, o demandado apresentou contestação (Id. 84685146) alegando, em síntese, que a cobrança é regular, evidenciada pela utilização de serviços não essenciais (extratos de Id. 84685147 e tabela da cesta de Id. 84685150) e pela anuência tácita da autora, arguindo preliminares e prescrição e sustentando a inexistência de dano moral e o descabimento da restituição em dobro, além de formular pedido contraposto de pagamento das tarifas avulsas.</w:t>
+        <w:t xml:space="preserve">Citado, o demandado apresentou contestação (Id. 84685146) alegando, em síntese, que a cesta é regular, dado o uso de serviços não essenciais (Id. 84685147), e que não há dano moral, deduzindo, ainda, preliminares, prescrição e pedido contraposto.</w:t>
       </w:r>
     </w:p>
     <w:p>
@@ -102,7 +102,7 @@
           <w:color w:val="000000"/>
           <w:sz w:val="24"/>
         </w:rPr>
-        <w:t xml:space="preserve">Em réplica (Id. 88054763), a parte autora alegou que o réu não juntou o termo de adesão à cesta de serviços e que a conta se destina exclusivamente ao recebimento de seu benefício previdenciário.</w:t>
+        <w:t xml:space="preserve">Em réplica (Id. 88054763), a parte autora alegou que o réu não juntou o termo de adesão à cesta de serviços.</w:t>
       </w:r>
     </w:p>
     <w:p>

</xml_diff>